<commit_message>
Complete Week 8 Activites
</commit_message>
<xml_diff>
--- a/week8/Stage_5_Lab_Student_Handout.docx
+++ b/week8/Stage_5_Lab_Student_Handout.docx
@@ -1,6 +1,6 @@
 
 <file path=word/document.xml><?xml version="1.0" encoding="utf-8"?>
-<w:document xmlns:wpc="http://schemas.microsoft.com/office/word/2010/wordprocessingCanvas" xmlns:cx="http://schemas.microsoft.com/office/drawing/2014/chartex" xmlns:cx1="http://schemas.microsoft.com/office/drawing/2015/9/8/chartex" xmlns:cx2="http://schemas.microsoft.com/office/drawing/2015/10/21/chartex" xmlns:cx3="http://schemas.microsoft.com/office/drawing/2016/5/9/chartex" xmlns:cx4="http://schemas.microsoft.com/office/drawing/2016/5/10/chartex" xmlns:cx5="http://schemas.microsoft.com/office/drawing/2016/5/11/chartex" xmlns:cx6="http://schemas.microsoft.com/office/drawing/2016/5/12/chartex" xmlns:cx7="http://schemas.microsoft.com/office/drawing/2016/5/13/chartex" xmlns:cx8="http://schemas.microsoft.com/office/drawing/2016/5/14/chartex" xmlns:mc="http://schemas.openxmlformats.org/markup-compatibility/2006" xmlns:aink="http://schemas.microsoft.com/office/drawing/2016/ink" xmlns:am3d="http://schemas.microsoft.com/office/drawing/2017/model3d" xmlns:o="urn:schemas-microsoft-com:office:office" xmlns:oel="http://schemas.microsoft.com/office/2019/extlst" xmlns:r="http://schemas.openxmlformats.org/officeDocument/2006/relationships" xmlns:m="http://schemas.openxmlformats.org/officeDocument/2006/math" xmlns:v="urn:schemas-microsoft-com:vml" xmlns:wp14="http://schemas.microsoft.com/office/word/2010/wordprocessingDrawing" xmlns:wp="http://schemas.openxmlformats.org/drawingml/2006/wordprocessingDrawing" xmlns:w10="urn:schemas-microsoft-com:office:word" xmlns:w="http://schemas.openxmlformats.org/wordprocessingml/2006/main" xmlns:w14="http://schemas.microsoft.com/office/word/2010/wordml" xmlns:w15="http://schemas.microsoft.com/office/word/2012/wordml" xmlns:w16cei="http://schemas.microsoft.com/office/word/2026/wordml/cei" xmlns:w16cex="http://schemas.microsoft.com/office/word/2018/wordml/cex" xmlns:w16cid="http://schemas.microsoft.com/office/word/2016/wordml/cid" xmlns:w16="http://schemas.microsoft.com/office/word/2018/wordml" xmlns:w16du="http://schemas.microsoft.com/office/word/2023/wordml/word16du" xmlns:w16sdtdh="http://schemas.microsoft.com/office/word/2020/wordml/sdtdatahash" xmlns:w16sdtfl="http://schemas.microsoft.com/office/word/2024/wordml/sdtformatlock" xmlns:w16se="http://schemas.microsoft.com/office/word/2015/wordml/symex" xmlns:wpg="http://schemas.microsoft.com/office/word/2010/wordprocessingGroup" xmlns:wpi="http://schemas.microsoft.com/office/word/2010/wordprocessingInk" xmlns:wne="http://schemas.microsoft.com/office/word/2006/wordml" xmlns:wps="http://schemas.microsoft.com/office/word/2010/wordprocessingShape" mc:Ignorable="w14 w15 w16se w16cid w16 w16cex w16sdtdh w16sdtfl w16du wp14">
+<w:document xmlns:wpc="http://schemas.microsoft.com/office/word/2010/wordprocessingCanvas" xmlns:cx="http://schemas.microsoft.com/office/drawing/2014/chartex" xmlns:cx1="http://schemas.microsoft.com/office/drawing/2015/9/8/chartex" xmlns:cx2="http://schemas.microsoft.com/office/drawing/2015/10/21/chartex" xmlns:cx3="http://schemas.microsoft.com/office/drawing/2016/5/9/chartex" xmlns:cx4="http://schemas.microsoft.com/office/drawing/2016/5/10/chartex" xmlns:cx5="http://schemas.microsoft.com/office/drawing/2016/5/11/chartex" xmlns:cx6="http://schemas.microsoft.com/office/drawing/2016/5/12/chartex" xmlns:cx7="http://schemas.microsoft.com/office/drawing/2016/5/13/chartex" xmlns:cx8="http://schemas.microsoft.com/office/drawing/2016/5/14/chartex" xmlns:mc="http://schemas.openxmlformats.org/markup-compatibility/2006" xmlns:aink="http://schemas.microsoft.com/office/drawing/2016/ink" xmlns:am3d="http://schemas.microsoft.com/office/drawing/2017/model3d" xmlns:o="urn:schemas-microsoft-com:office:office" xmlns:oel="http://schemas.microsoft.com/office/2019/extlst" xmlns:r="http://schemas.openxmlformats.org/officeDocument/2006/relationships" xmlns:m="http://schemas.openxmlformats.org/officeDocument/2006/math" xmlns:v="urn:schemas-microsoft-com:vml" xmlns:wp14="http://schemas.microsoft.com/office/word/2010/wordprocessingDrawing" xmlns:wp="http://schemas.openxmlformats.org/drawingml/2006/wordprocessingDrawing" xmlns:w10="urn:schemas-microsoft-com:office:word" xmlns:w="http://schemas.openxmlformats.org/wordprocessingml/2006/main" xmlns:w14="http://schemas.microsoft.com/office/word/2010/wordml" xmlns:w15="http://schemas.microsoft.com/office/word/2012/wordml" xmlns:w16cex="http://schemas.microsoft.com/office/word/2018/wordml/cex" xmlns:w16cid="http://schemas.microsoft.com/office/word/2016/wordml/cid" xmlns:w16="http://schemas.microsoft.com/office/word/2018/wordml" xmlns:w16du="http://schemas.microsoft.com/office/word/2023/wordml/word16du" xmlns:w16sdtdh="http://schemas.microsoft.com/office/word/2020/wordml/sdtdatahash" xmlns:w16sdtfl="http://schemas.microsoft.com/office/word/2024/wordml/sdtformatlock" xmlns:w16se="http://schemas.microsoft.com/office/word/2015/wordml/symex" xmlns:wpg="http://schemas.microsoft.com/office/word/2010/wordprocessingGroup" xmlns:wpi="http://schemas.microsoft.com/office/word/2010/wordprocessingInk" xmlns:wne="http://schemas.microsoft.com/office/word/2006/wordml" xmlns:wps="http://schemas.microsoft.com/office/word/2010/wordprocessingShape" mc:Ignorable="w14 w15 w16se w16cid w16 w16cex w16sdtdh w16sdtfl w16du wp14">
   <w:body>
     <w:p>
       <w:pPr>
@@ -63,16 +63,113 @@
       </w:r>
     </w:p>
     <w:p>
-      <w:pPr>
-        <w:pStyle w:val="Heading1"/>
-      </w:pPr>
-      <w:r>
-        <w:t>B - Propose Architecture</w:t>
+      <w:r>
+        <w:t>book_appointment(), view_upcoming_a</w:t>
+      </w:r>
+      <w:r>
+        <w:t>pointments()</w:t>
+      </w:r>
+      <w:r>
+        <w:t xml:space="preserve"> (appointment spelt incorrectly in code, referenced here to match code), get_schedule(), update</w:t>
+      </w:r>
+      <w:r>
+        <w:t>_status(), and reschedule() are stubs. Only __init__, the properties, validate(), cancel(), and opt_in_for_reminders</w:t>
+      </w:r>
+      <w:r>
+        <w:t>() actually run code.</w:t>
       </w:r>
     </w:p>
     <w:p>
       <w:r>
-        <w:t>Draw Presentation -&gt; Service -&gt; Domain, with Service using a Repository abstraction and Persistence implementing it.</w:t>
+        <w:t>There is no data-access code anywhere, and no presentation code either</w:t>
+      </w:r>
+      <w:r>
+        <w:t xml:space="preserve"> – no __main__ block, no print() anywhere in the file. So there is nothing mixed in from either</w:t>
+      </w:r>
+      <w:r>
+        <w:t xml:space="preserve"> of those two layers to find.</w:t>
+      </w:r>
+    </w:p>
+    <w:p>
+      <w:r>
+        <w:t>Has_conflict() does not</w:t>
+      </w:r>
+      <w:r>
+        <w:t xml:space="preserve"> exist in the code at all, even though the approved UML diagram lists it as one of the practitioner’s 3 operations. get_sche</w:t>
+      </w:r>
+      <w:r>
+        <w:t>dule</w:t>
+      </w:r>
+      <w:r>
+        <w:t>()’s stub error message</w:t>
+      </w:r>
+      <w:r>
+        <w:t xml:space="preserve"> still reads “…to check for appointment conflicts” – leftover text from what was </w:t>
+      </w:r>
+      <w:r>
+        <w:t>has_conflict() before it was deleted or merged by mistake. This is a regression</w:t>
+      </w:r>
+      <w:r>
+        <w:t xml:space="preserve"> against the approved design</w:t>
+      </w:r>
+      <w:r>
+        <w:t>, not a deliberate decision. This is fixed in part D</w:t>
+      </w:r>
+      <w:r>
+        <w:t xml:space="preserve"> because the service would not work without it.</w:t>
+      </w:r>
+    </w:p>
+    <w:p>
+      <w:r>
+        <w:t>2 unrelated bugs found</w:t>
+      </w:r>
+      <w:r>
+        <w:t>, fixing the</w:t>
+      </w:r>
+      <w:r>
+        <w:t>m is not what this stage is about, so they will be left alone</w:t>
+      </w:r>
+      <w:r>
+        <w:t>. opt_in_for_reminders()</w:t>
+      </w:r>
+      <w:r>
+        <w:t xml:space="preserve"> does self.__reminders</w:t>
+      </w:r>
+      <w:r>
+        <w:t>_opt_in – opt_in (a minus sign) instead of = opt_in, so calling it does nothing</w:t>
+      </w:r>
+      <w:r>
+        <w:t>. view_upcoming_apointments() is mi</w:t>
+      </w:r>
+      <w:r>
+        <w:t>sspelled (matches the code, not the diagram, which spells it correctly.</w:t>
+      </w:r>
+    </w:p>
+    <w:p>
+      <w:r>
+        <w:t>Patient.book_appointment(practitioner, when) is a stub, but implementing it properly would require Patient to check</w:t>
+      </w:r>
+      <w:r>
+        <w:t xml:space="preserve"> a conflict on a different object (Practitioner), then it would need to create a 3</w:t>
+      </w:r>
+      <w:r>
+        <w:rPr>
+          <w:vertAlign w:val="superscript"/>
+        </w:rPr>
+        <w:t>rd</w:t>
+      </w:r>
+      <w:r>
+        <w:t xml:space="preserve"> object</w:t>
+      </w:r>
+      <w:r>
+        <w:t xml:space="preserve"> (Appointment), then link both sides. That is coordination of a multi-object use case, sitting on a single domain entity.</w:t>
+      </w:r>
+      <w:r>
+        <w:br/>
+        <w:t>Evidence: then method</w:t>
+      </w:r>
+      <w:r>
+        <w:t>’s own signature takes a Practitioner in, which a patient’s own data never needs to know about for anything else.</w:t>
       </w:r>
     </w:p>
     <w:p>
@@ -80,12 +177,65 @@
         <w:pStyle w:val="Heading1"/>
       </w:pPr>
       <w:r>
-        <w:t>C - Create Package Structure</w:t>
+        <w:t>B - Propose Architecture</w:t>
       </w:r>
     </w:p>
     <w:p>
       <w:r>
-        <w:t>Create domain/, services/, repositories/, persistence/ and presentation/ or a justified equivalent.</w:t>
+        <w:t>Draw Presentation -&gt; Service -&gt; Domain, with Service using a Repository abstraction and Persistence implementing it.</w:t>
+      </w:r>
+    </w:p>
+    <w:p>
+      <w:r>
+        <w:rPr>
+          <w:i/>
+          <w:iCs/>
+        </w:rPr>
+        <w:t>Since v0.4 has no data-access or presentation code yet</w:t>
+      </w:r>
+      <w:r>
+        <w:rPr>
+          <w:i/>
+          <w:iCs/>
+        </w:rPr>
+        <w:t>, this will propose the target shape for v0.5 to grow into, not correcting entrenched violations</w:t>
+      </w:r>
+      <w:r>
+        <w:rPr>
+          <w:i/>
+          <w:iCs/>
+        </w:rPr>
+        <w:t>.</w:t>
+      </w:r>
+    </w:p>
+    <w:p>
+      <w:r>
+        <w:lastRenderedPageBreak/>
+        <w:t>Presentation calls Service.</w:t>
+      </w:r>
+      <w:r>
+        <w:t xml:space="preserve"> It </w:t>
+      </w:r>
+      <w:r>
+        <w:t>is also the composition root: the one place that knows about the concrete Persistence class.</w:t>
+      </w:r>
+      <w:r>
+        <w:br/>
+        <w:t>Service depends on Domain</w:t>
+      </w:r>
+      <w:r>
+        <w:t xml:space="preserve"> (to create and use domain objects) and on the Repository abstraction (to save them) – never on Persistence directly.</w:t>
+      </w:r>
+      <w:r>
+        <w:br/>
+        <w:t>Domain depends on nothing else in the package – Innermost layer.</w:t>
+      </w:r>
+      <w:r>
+        <w:br/>
+        <w:t>Persistence depends on Domain</w:t>
+      </w:r>
+      <w:r>
+        <w:t xml:space="preserve"> to know what it is storing and implements the Repository abstraction.</w:t>
       </w:r>
     </w:p>
     <w:p>
@@ -93,12 +243,12 @@
         <w:pStyle w:val="Heading1"/>
       </w:pPr>
       <w:r>
-        <w:t>D - Introduce AppointmentService</w:t>
+        <w:t>C - Create Package Structure</w:t>
       </w:r>
     </w:p>
     <w:p>
       <w:r>
-        <w:t>Move workflow coordination into a focused service without stealing Appointment domain behaviour.</w:t>
+        <w:t>Create domain/, services/, repositories/, persistence/ and presentation/ or a justified equivalent.</w:t>
       </w:r>
     </w:p>
     <w:p>
@@ -106,12 +256,42 @@
         <w:pStyle w:val="Heading1"/>
       </w:pPr>
       <w:r>
-        <w:t>E - Repository Abstraction</w:t>
+        <w:t>D - Introduce AppointmentService</w:t>
       </w:r>
     </w:p>
     <w:p>
       <w:r>
-        <w:t>Define a small AppointmentRepository contract using only current use-case needs.</w:t>
+        <w:t>Move workflow coordination into a focused service without stealing Appointment domain behaviour.</w:t>
+      </w:r>
+    </w:p>
+    <w:p>
+      <w:r>
+        <w:t>Practitioner.has_conflict(when) restored. The Service cannot check a conflict without it, so this needed to exist</w:t>
+      </w:r>
+      <w:r>
+        <w:t xml:space="preserve"> before book_appointment could be real code rather than another stub calling a stub.</w:t>
+      </w:r>
+      <w:r>
+        <w:br/>
+        <w:t>get_schedule()’s error message corrected to describe its own job, since it had has_conflict’s leftover text.</w:t>
+      </w:r>
+      <w:r>
+        <w:br/>
+        <w:t>Patient.book_appointment() removed</w:t>
+      </w:r>
+      <w:r>
+        <w:t>. It’s coordination job is now AppointmentService.book_appointment(patient, practitioner, when).</w:t>
+      </w:r>
+    </w:p>
+    <w:p>
+      <w:r>
+        <w:t>Appointment itself has not been touched</w:t>
+      </w:r>
+      <w:r>
+        <w:t>, no domain behaviour was taken from it, only coordination that was never really its job was relocated</w:t>
+      </w:r>
+      <w:r>
+        <w:t>.</w:t>
       </w:r>
     </w:p>
     <w:p>
@@ -119,12 +299,118 @@
         <w:pStyle w:val="Heading1"/>
       </w:pPr>
       <w:r>
-        <w:t>F - AI Architecture Review</w:t>
+        <w:t>E - Repository Abstraction</w:t>
       </w:r>
     </w:p>
     <w:p>
       <w:r>
-        <w:t>Ask AI to review dependency direction, misplaced responsibilities and unnecessary complexity; request simplest justified improvements.</w:t>
+        <w:t>Define a small AppointmentRepository contract using only current use-case needs.</w:t>
+      </w:r>
+    </w:p>
+    <w:p>
+      <w:r>
+        <w:drawing>
+          <wp:inline distT="0" distB="0" distL="0" distR="0" wp14:anchorId="305C3778" wp14:editId="5CC8C112">
+            <wp:extent cx="6187976" cy="2789162"/>
+            <wp:effectExtent l="0" t="0" r="3810" b="0"/>
+            <wp:docPr id="1023392315" name="Picture 1"/>
+            <wp:cNvGraphicFramePr>
+              <a:graphicFrameLocks xmlns:a="http://schemas.openxmlformats.org/drawingml/2006/main" noChangeAspect="1"/>
+            </wp:cNvGraphicFramePr>
+            <a:graphic xmlns:a="http://schemas.openxmlformats.org/drawingml/2006/main">
+              <a:graphicData uri="http://schemas.openxmlformats.org/drawingml/2006/picture">
+                <pic:pic xmlns:pic="http://schemas.openxmlformats.org/drawingml/2006/picture">
+                  <pic:nvPicPr>
+                    <pic:cNvPr id="1023392315" name=""/>
+                    <pic:cNvPicPr/>
+                  </pic:nvPicPr>
+                  <pic:blipFill>
+                    <a:blip r:embed="rId6"/>
+                    <a:stretch>
+                      <a:fillRect/>
+                    </a:stretch>
+                  </pic:blipFill>
+                  <pic:spPr>
+                    <a:xfrm>
+                      <a:off x="0" y="0"/>
+                      <a:ext cx="6187976" cy="2789162"/>
+                    </a:xfrm>
+                    <a:prstGeom prst="rect">
+                      <a:avLst/>
+                    </a:prstGeom>
+                  </pic:spPr>
+                </pic:pic>
+              </a:graphicData>
+            </a:graphic>
+          </wp:inline>
+        </w:drawing>
+      </w:r>
+    </w:p>
+    <w:p>
+      <w:r>
+        <w:t>add() is needed because book_appointment has to save what it creates.</w:t>
+      </w:r>
+      <w:r>
+        <w:br/>
+        <w:t>get_by_id() is needed to verify the save worked</w:t>
+      </w:r>
+      <w:r>
+        <w:t>.</w:t>
+      </w:r>
+      <w:r>
+        <w:br/>
+        <w:t>No list/search/update/delete methods were added, because no current use case calls for them</w:t>
+      </w:r>
+      <w:r>
+        <w:t>.</w:t>
+      </w:r>
+    </w:p>
+    <w:p>
+      <w:pPr>
+        <w:pStyle w:val="Heading2"/>
+      </w:pPr>
+      <w:r>
+        <w:lastRenderedPageBreak/>
+        <w:t>Concrete implementation</w:t>
+      </w:r>
+    </w:p>
+    <w:p>
+      <w:r>
+        <w:drawing>
+          <wp:inline distT="0" distB="0" distL="0" distR="0" wp14:anchorId="52744161" wp14:editId="50FD119C">
+            <wp:extent cx="5220152" cy="1714649"/>
+            <wp:effectExtent l="0" t="0" r="0" b="0"/>
+            <wp:docPr id="1223066901" name="Picture 1"/>
+            <wp:cNvGraphicFramePr>
+              <a:graphicFrameLocks xmlns:a="http://schemas.openxmlformats.org/drawingml/2006/main" noChangeAspect="1"/>
+            </wp:cNvGraphicFramePr>
+            <a:graphic xmlns:a="http://schemas.openxmlformats.org/drawingml/2006/main">
+              <a:graphicData uri="http://schemas.openxmlformats.org/drawingml/2006/picture">
+                <pic:pic xmlns:pic="http://schemas.openxmlformats.org/drawingml/2006/picture">
+                  <pic:nvPicPr>
+                    <pic:cNvPr id="1223066901" name=""/>
+                    <pic:cNvPicPr/>
+                  </pic:nvPicPr>
+                  <pic:blipFill>
+                    <a:blip r:embed="rId7"/>
+                    <a:stretch>
+                      <a:fillRect/>
+                    </a:stretch>
+                  </pic:blipFill>
+                  <pic:spPr>
+                    <a:xfrm>
+                      <a:off x="0" y="0"/>
+                      <a:ext cx="5220152" cy="1714649"/>
+                    </a:xfrm>
+                    <a:prstGeom prst="rect">
+                      <a:avLst/>
+                    </a:prstGeom>
+                  </pic:spPr>
+                </pic:pic>
+              </a:graphicData>
+            </a:graphic>
+          </wp:inline>
+        </w:drawing>
       </w:r>
     </w:p>
     <w:p>
@@ -132,12 +418,45 @@
         <w:pStyle w:val="Heading1"/>
       </w:pPr>
       <w:r>
-        <w:t>G - Refactor and Verify</w:t>
+        <w:t>F - AI Architecture Review</w:t>
       </w:r>
     </w:p>
     <w:p>
       <w:r>
-        <w:t>Apply only justified changes and confirm required behaviour remains unchanged.</w:t>
+        <w:t>Ask AI to review dependency direction, misplaced responsibilities and unnecessary complexity; request simplest justified improvements.</w:t>
+      </w:r>
+    </w:p>
+    <w:p>
+      <w:r>
+        <w:t>Accepted: Practitioner</w:t>
+      </w:r>
+      <w:r>
+        <w:t>.appointments is a fully public list (not even a leading underscore) that the Service now appends to directly</w:t>
+      </w:r>
+      <w:r>
+        <w:t>. Fix: add_appointments() plus a read-only property.</w:t>
+      </w:r>
+    </w:p>
+    <w:p>
+      <w:r>
+        <w:t xml:space="preserve">Modified: The module-level id counter is hidden </w:t>
+      </w:r>
+      <w:r>
+        <w:t>global state that keeps climbing across unrelated calls in the same process. Rather than building a separate id</w:t>
+      </w:r>
+      <w:r>
+        <w:t>-generation service, the generator became an injectable construction parameter with the same counter as its default.</w:t>
+      </w:r>
+    </w:p>
+    <w:p>
+      <w:r>
+        <w:t>Rejected (3): Splitting Repository into Read/Write interfaces</w:t>
+      </w:r>
+      <w:r>
+        <w:t>, a dependency-injection framework, and microservices with an event bus.</w:t>
+      </w:r>
+      <w:r>
+        <w:t xml:space="preserve"> None solve a problem that exists in a single small in-process program with one developer and nine functional requirements.</w:t>
       </w:r>
     </w:p>
     <w:p>
@@ -145,12 +464,220 @@
         <w:pStyle w:val="Heading1"/>
       </w:pPr>
       <w:r>
-        <w:t>H - Reflection</w:t>
+        <w:t>G - Refactor and Verify</w:t>
       </w:r>
     </w:p>
     <w:p>
       <w:r>
-        <w:t>Document one AI suggestion accepted, one modified and one rejected/deferred.</w:t>
+        <w:t>Apply only justified changes and confirm required behaviour remains unchanged.</w:t>
+      </w:r>
+    </w:p>
+    <w:p>
+      <w:pPr>
+        <w:pStyle w:val="Heading2"/>
+      </w:pPr>
+      <w:r>
+        <w:t>Practitioner</w:t>
+      </w:r>
+      <w:r>
+        <w:t>, after encapsulating the appointments list:</w:t>
+      </w:r>
+    </w:p>
+    <w:p>
+      <w:r>
+        <w:drawing>
+          <wp:inline distT="0" distB="0" distL="0" distR="0" wp14:anchorId="63841350" wp14:editId="5CE5C95E">
+            <wp:extent cx="5639289" cy="1691787"/>
+            <wp:effectExtent l="0" t="0" r="0" b="3810"/>
+            <wp:docPr id="956577493" name="Picture 1"/>
+            <wp:cNvGraphicFramePr>
+              <a:graphicFrameLocks xmlns:a="http://schemas.openxmlformats.org/drawingml/2006/main" noChangeAspect="1"/>
+            </wp:cNvGraphicFramePr>
+            <a:graphic xmlns:a="http://schemas.openxmlformats.org/drawingml/2006/main">
+              <a:graphicData uri="http://schemas.openxmlformats.org/drawingml/2006/picture">
+                <pic:pic xmlns:pic="http://schemas.openxmlformats.org/drawingml/2006/picture">
+                  <pic:nvPicPr>
+                    <pic:cNvPr id="956577493" name=""/>
+                    <pic:cNvPicPr/>
+                  </pic:nvPicPr>
+                  <pic:blipFill>
+                    <a:blip r:embed="rId8"/>
+                    <a:stretch>
+                      <a:fillRect/>
+                    </a:stretch>
+                  </pic:blipFill>
+                  <pic:spPr>
+                    <a:xfrm>
+                      <a:off x="0" y="0"/>
+                      <a:ext cx="5639289" cy="1691787"/>
+                    </a:xfrm>
+                    <a:prstGeom prst="rect">
+                      <a:avLst/>
+                    </a:prstGeom>
+                  </pic:spPr>
+                </pic:pic>
+              </a:graphicData>
+            </a:graphic>
+          </wp:inline>
+        </w:drawing>
+      </w:r>
+    </w:p>
+    <w:p>
+      <w:pPr>
+        <w:pStyle w:val="Heading2"/>
+      </w:pPr>
+      <w:r>
+        <w:lastRenderedPageBreak/>
+        <w:t>AppointmentService, after making the id generator injectable:</w:t>
+      </w:r>
+    </w:p>
+    <w:p>
+      <w:r>
+        <w:drawing>
+          <wp:inline distT="0" distB="0" distL="0" distR="0" wp14:anchorId="40393777" wp14:editId="6E11A62C">
+            <wp:extent cx="4419983" cy="3970364"/>
+            <wp:effectExtent l="0" t="0" r="0" b="0"/>
+            <wp:docPr id="232488053" name="Picture 1"/>
+            <wp:cNvGraphicFramePr>
+              <a:graphicFrameLocks xmlns:a="http://schemas.openxmlformats.org/drawingml/2006/main" noChangeAspect="1"/>
+            </wp:cNvGraphicFramePr>
+            <a:graphic xmlns:a="http://schemas.openxmlformats.org/drawingml/2006/main">
+              <a:graphicData uri="http://schemas.openxmlformats.org/drawingml/2006/picture">
+                <pic:pic xmlns:pic="http://schemas.openxmlformats.org/drawingml/2006/picture">
+                  <pic:nvPicPr>
+                    <pic:cNvPr id="232488053" name=""/>
+                    <pic:cNvPicPr/>
+                  </pic:nvPicPr>
+                  <pic:blipFill>
+                    <a:blip r:embed="rId9"/>
+                    <a:stretch>
+                      <a:fillRect/>
+                    </a:stretch>
+                  </pic:blipFill>
+                  <pic:spPr>
+                    <a:xfrm>
+                      <a:off x="0" y="0"/>
+                      <a:ext cx="4419983" cy="3970364"/>
+                    </a:xfrm>
+                    <a:prstGeom prst="rect">
+                      <a:avLst/>
+                    </a:prstGeom>
+                  </pic:spPr>
+                </pic:pic>
+              </a:graphicData>
+            </a:graphic>
+          </wp:inline>
+        </w:drawing>
+      </w:r>
+    </w:p>
+    <w:p>
+      <w:pPr>
+        <w:pStyle w:val="Heading2"/>
+      </w:pPr>
+      <w:r>
+        <w:t>Verification</w:t>
+      </w:r>
+    </w:p>
+    <w:p>
+      <w:r>
+        <w:t>--- Booking through the service (replaces Patient.book_appointment) ---</w:t>
+      </w:r>
+      <w:r>
+        <w:br/>
+      </w:r>
+      <w:r>
+        <w:t>[PASS] Booking returns a SCHEDULED appointment</w:t>
+      </w:r>
+      <w:r>
+        <w:br/>
+      </w:r>
+      <w:r>
+        <w:t>[PASS] The appointment is linked to the practitioner</w:t>
+      </w:r>
+      <w:r>
+        <w:br/>
+      </w:r>
+      <w:r>
+        <w:t>[PASS] The repository has the appointment</w:t>
+      </w:r>
+      <w:r>
+        <w:br/>
+      </w:r>
+      <w:r>
+        <w:t>[PASS] A second booking at the same time is rejected (FR-02, now real)</w:t>
+      </w:r>
+      <w:r>
+        <w:br/>
+      </w:r>
+      <w:r>
+        <w:t>[PASS] A booking at a different time succeeds</w:t>
+      </w:r>
+    </w:p>
+    <w:p>
+      <w:r>
+        <w:t>--- Practitioner.appointments encapsulation (Part G change) ---</w:t>
+      </w:r>
+      <w:r>
+        <w:br/>
+      </w:r>
+      <w:r>
+        <w:t>[PASS] appointments is a read-only tuple, not the internal list</w:t>
+      </w:r>
+      <w:r>
+        <w:br/>
+      </w:r>
+      <w:r>
+        <w:t>[PASS] Appending directly no longer reaches internal state</w:t>
+      </w:r>
+      <w:r>
+        <w:br/>
+      </w:r>
+      <w:r>
+        <w:t>[PASS] The only way in is add_appointment(), which type-checks its argument</w:t>
+      </w:r>
+    </w:p>
+    <w:p>
+      <w:r>
+        <w:t>--- Appointment behaviour is untouched from Stage 4 ---</w:t>
+      </w:r>
+      <w:r>
+        <w:br/>
+      </w:r>
+      <w:r>
+        <w:t>[PASS] Cancel still works</w:t>
+      </w:r>
+      <w:r>
+        <w:br/>
+      </w:r>
+      <w:r>
+        <w:t>[PASS] Cancelling twice still raises InvalidStatusTransitionError</w:t>
+      </w:r>
+      <w:r>
+        <w:br/>
+      </w:r>
+      <w:r>
+        <w:t>[PASS] A cancelled slot is free again (has_conflict, now real)</w:t>
+      </w:r>
+    </w:p>
+    <w:p>
+      <w:r>
+        <w:t>11/11 checks passed</w:t>
+      </w:r>
+    </w:p>
+    <w:p>
+      <w:r>
+        <w:t>--- Injectable id generator (Part F-&gt;G modification) ---</w:t>
+      </w:r>
+      <w:r>
+        <w:br/>
+      </w:r>
+      <w:r>
+        <w:t>[PASS] A test can inject a predictable id generator (got 'FIXED-1')</w:t>
+      </w:r>
+    </w:p>
+    <w:p>
+      <w:r>
+        <w:t>Behaviour that must stay identical: cancel() still works and still rejects a repeated cancel (both untouched since stage 4).</w:t>
       </w:r>
     </w:p>
     <w:p>
@@ -159,6 +686,76 @@
       </w:pPr>
       <w:r>
         <w:lastRenderedPageBreak/>
+        <w:t>H - Reflection</w:t>
+      </w:r>
+    </w:p>
+    <w:p>
+      <w:r>
+        <w:t>Document one AI suggestion accepted, one modified and one rejected/deferred.</w:t>
+      </w:r>
+    </w:p>
+    <w:p>
+      <w:r>
+        <w:t>Accepted:</w:t>
+      </w:r>
+      <w:r>
+        <w:t xml:space="preserve"> Encapsulating Practitoner’s appointment list</w:t>
+      </w:r>
+      <w:r>
+        <w:t xml:space="preserve"> (add_appointment() and a read-only property). This fixed a concrete problem that Service’s own code</w:t>
+      </w:r>
+      <w:r>
+        <w:t xml:space="preserve"> had just </w:t>
+      </w:r>
+      <w:r>
+        <w:t>made worse, on a list that had no privacy marker at all in the submitted code.</w:t>
+      </w:r>
+    </w:p>
+    <w:p>
+      <w:r>
+        <w:t>Modified:</w:t>
+      </w:r>
+      <w:r>
+        <w:t xml:space="preserve"> The id generator. The underlying concern (hidden global counter state) was real, but the Ai’s </w:t>
+      </w:r>
+      <w:r>
+        <w:t>instinct was to solve it with more architecture</w:t>
+      </w:r>
+      <w:r>
+        <w:t xml:space="preserve"> (a dedicated id-generation abstraction); an injectable constructor parameter was enough.</w:t>
+      </w:r>
+    </w:p>
+    <w:p>
+      <w:r>
+        <w:t>Rejected</w:t>
+      </w:r>
+      <w:r>
+        <w:t>/De</w:t>
+      </w:r>
+      <w:r>
+        <w:t>ferred</w:t>
+      </w:r>
+      <w:r>
+        <w:t>:</w:t>
+      </w:r>
+      <w:r>
+        <w:t xml:space="preserve"> </w:t>
+      </w:r>
+      <w:r>
+        <w:t xml:space="preserve">Splitting the repository into Read/Write interfaces, a </w:t>
+      </w:r>
+      <w:r>
+        <w:t xml:space="preserve">dependency-injection </w:t>
+      </w:r>
+      <w:r>
+        <w:t>framework, and microservices with an event bus. Each would add indirection that nothing in the current requirements or the current codebase’s size justifies.</w:t>
+      </w:r>
+    </w:p>
+    <w:p>
+      <w:pPr>
+        <w:pStyle w:val="Heading1"/>
+      </w:pPr>
+      <w:r>
         <w:t>Suggested AI prompt</w:t>
       </w:r>
     </w:p>
@@ -178,7 +775,7 @@
 </file>
 
 <file path=word/numbering.xml><?xml version="1.0" encoding="utf-8"?>
-<w:numbering xmlns:wpc="http://schemas.microsoft.com/office/word/2010/wordprocessingCanvas" xmlns:cx="http://schemas.microsoft.com/office/drawing/2014/chartex" xmlns:cx1="http://schemas.microsoft.com/office/drawing/2015/9/8/chartex" xmlns:cx2="http://schemas.microsoft.com/office/drawing/2015/10/21/chartex" xmlns:cx3="http://schemas.microsoft.com/office/drawing/2016/5/9/chartex" xmlns:cx4="http://schemas.microsoft.com/office/drawing/2016/5/10/chartex" xmlns:cx5="http://schemas.microsoft.com/office/drawing/2016/5/11/chartex" xmlns:cx6="http://schemas.microsoft.com/office/drawing/2016/5/12/chartex" xmlns:cx7="http://schemas.microsoft.com/office/drawing/2016/5/13/chartex" xmlns:cx8="http://schemas.microsoft.com/office/drawing/2016/5/14/chartex" xmlns:mc="http://schemas.openxmlformats.org/markup-compatibility/2006" xmlns:aink="http://schemas.microsoft.com/office/drawing/2016/ink" xmlns:am3d="http://schemas.microsoft.com/office/drawing/2017/model3d" xmlns:o="urn:schemas-microsoft-com:office:office" xmlns:oel="http://schemas.microsoft.com/office/2019/extlst" xmlns:r="http://schemas.openxmlformats.org/officeDocument/2006/relationships" xmlns:m="http://schemas.openxmlformats.org/officeDocument/2006/math" xmlns:v="urn:schemas-microsoft-com:vml" xmlns:wp14="http://schemas.microsoft.com/office/word/2010/wordprocessingDrawing" xmlns:wp="http://schemas.openxmlformats.org/drawingml/2006/wordprocessingDrawing" xmlns:w10="urn:schemas-microsoft-com:office:word" xmlns:w="http://schemas.openxmlformats.org/wordprocessingml/2006/main" xmlns:w14="http://schemas.microsoft.com/office/word/2010/wordml" xmlns:w15="http://schemas.microsoft.com/office/word/2012/wordml" xmlns:w16cei="http://schemas.microsoft.com/office/word/2026/wordml/cei" xmlns:w16cex="http://schemas.microsoft.com/office/word/2018/wordml/cex" xmlns:w16cid="http://schemas.microsoft.com/office/word/2016/wordml/cid" xmlns:w16="http://schemas.microsoft.com/office/word/2018/wordml" xmlns:w16du="http://schemas.microsoft.com/office/word/2023/wordml/word16du" xmlns:w16sdtdh="http://schemas.microsoft.com/office/word/2020/wordml/sdtdatahash" xmlns:w16sdtfl="http://schemas.microsoft.com/office/word/2024/wordml/sdtformatlock" xmlns:w16se="http://schemas.microsoft.com/office/word/2015/wordml/symex" xmlns:wpg="http://schemas.microsoft.com/office/word/2010/wordprocessingGroup" xmlns:wpi="http://schemas.microsoft.com/office/word/2010/wordprocessingInk" xmlns:wne="http://schemas.microsoft.com/office/word/2006/wordml" xmlns:wps="http://schemas.microsoft.com/office/word/2010/wordprocessingShape" mc:Ignorable="w14 w15 w16se w16cid w16 w16cex w16sdtdh w16sdtfl w16du wp14">
+<w:numbering xmlns:wpc="http://schemas.microsoft.com/office/word/2010/wordprocessingCanvas" xmlns:cx="http://schemas.microsoft.com/office/drawing/2014/chartex" xmlns:cx1="http://schemas.microsoft.com/office/drawing/2015/9/8/chartex" xmlns:cx2="http://schemas.microsoft.com/office/drawing/2015/10/21/chartex" xmlns:cx3="http://schemas.microsoft.com/office/drawing/2016/5/9/chartex" xmlns:cx4="http://schemas.microsoft.com/office/drawing/2016/5/10/chartex" xmlns:cx5="http://schemas.microsoft.com/office/drawing/2016/5/11/chartex" xmlns:cx6="http://schemas.microsoft.com/office/drawing/2016/5/12/chartex" xmlns:cx7="http://schemas.microsoft.com/office/drawing/2016/5/13/chartex" xmlns:cx8="http://schemas.microsoft.com/office/drawing/2016/5/14/chartex" xmlns:mc="http://schemas.openxmlformats.org/markup-compatibility/2006" xmlns:aink="http://schemas.microsoft.com/office/drawing/2016/ink" xmlns:am3d="http://schemas.microsoft.com/office/drawing/2017/model3d" xmlns:o="urn:schemas-microsoft-com:office:office" xmlns:oel="http://schemas.microsoft.com/office/2019/extlst" xmlns:r="http://schemas.openxmlformats.org/officeDocument/2006/relationships" xmlns:m="http://schemas.openxmlformats.org/officeDocument/2006/math" xmlns:v="urn:schemas-microsoft-com:vml" xmlns:wp14="http://schemas.microsoft.com/office/word/2010/wordprocessingDrawing" xmlns:wp="http://schemas.openxmlformats.org/drawingml/2006/wordprocessingDrawing" xmlns:w10="urn:schemas-microsoft-com:office:word" xmlns:w="http://schemas.openxmlformats.org/wordprocessingml/2006/main" xmlns:w14="http://schemas.microsoft.com/office/word/2010/wordml" xmlns:w15="http://schemas.microsoft.com/office/word/2012/wordml" xmlns:w16cex="http://schemas.microsoft.com/office/word/2018/wordml/cex" xmlns:w16cid="http://schemas.microsoft.com/office/word/2016/wordml/cid" xmlns:w16="http://schemas.microsoft.com/office/word/2018/wordml" xmlns:w16du="http://schemas.microsoft.com/office/word/2023/wordml/word16du" xmlns:w16sdtdh="http://schemas.microsoft.com/office/word/2020/wordml/sdtdatahash" xmlns:w16sdtfl="http://schemas.microsoft.com/office/word/2024/wordml/sdtformatlock" xmlns:w16se="http://schemas.microsoft.com/office/word/2015/wordml/symex" xmlns:wpg="http://schemas.microsoft.com/office/word/2010/wordprocessingGroup" xmlns:wpi="http://schemas.microsoft.com/office/word/2010/wordprocessingInk" xmlns:wne="http://schemas.microsoft.com/office/word/2006/wordml" xmlns:wps="http://schemas.microsoft.com/office/word/2010/wordprocessingShape" mc:Ignorable="w14 w15 w16se w16cid w16 w16cex w16sdtdh w16sdtfl w16du wp14">
   <w:abstractNum w:abstractNumId="0" w15:restartNumberingAfterBreak="0">
     <w:nsid w:val="FFFFFF7C"/>
     <w:multiLevelType w:val="singleLevel"/>
@@ -987,6 +1584,7 @@
   <w:style w:type="character" w:default="1" w:styleId="DefaultParagraphFont">
     <w:name w:val="Default Paragraph Font"/>
     <w:uiPriority w:val="1"/>
+    <w:semiHidden/>
     <w:unhideWhenUsed/>
   </w:style>
   <w:style w:type="table" w:default="1" w:styleId="TableNormal">

</xml_diff>